<commit_message>
feat: grant partners the read-only platform surfaces by default and log the account-manager naming split
</commit_message>
<xml_diff>
--- a/docs/partner-sop/DumosRx-Partner-SOP.docx
+++ b/docs/partner-sop/DumosRx-Partner-SOP.docx
@@ -59,7 +59,7 @@
           <w:color w:val="6B7280"/>
           <w:sz w:val="19"/>
         </w:rPr>
-        <w:t>Version 1.0 — October 2026</w:t>
+        <w:t>Version 1.0, October 2026</w:t>
       </w:r>
     </w:p>
     <w:p>
@@ -95,7 +95,7 @@
           <w:i w:val="0"/>
           <w:sz w:val="21"/>
         </w:rPr>
-        <w:t>You are an Account Manager. Every pharmacy that signs up through you is assigned to you permanently, and you own that relationship from first demo to daily use. The admin panel uses this exact term, so you will see your name on a store's Account Manager card.</w:t>
+        <w:t>Your job title is Account Manager. Every pharmacy that signs up through you is assigned to you permanently, and you own that relationship from first demo to daily use.</w:t>
       </w:r>
     </w:p>
     <w:p>
@@ -107,14 +107,86 @@
           <w:b/>
           <w:sz w:val="21"/>
         </w:rPr>
-        <w:t xml:space="preserve">A note on the word: </w:t>
+        <w:t xml:space="preserve">Three different names for related things, so they do not confuse you: </w:t>
+      </w:r>
+    </w:p>
+    <w:p>
+      <w:pPr>
+        <w:pStyle w:val="ListBullet"/>
+        <w:spacing w:after="60"/>
+      </w:pPr>
+      <w:r>
+        <w:rPr>
+          <w:b/>
+          <w:sz w:val="21"/>
+        </w:rPr>
+        <w:t>Account Manager</w:t>
       </w:r>
       <w:r>
         <w:rPr>
           <w:b w:val="0"/>
           <w:sz w:val="21"/>
         </w:rPr>
-        <w:t>"CRM" is the category of software used to track customer relationships, not a job title. The person holding the relationship is the account manager. Use that term with clients — it sounds like what it is.</w:t>
+        <w:t xml:space="preserve"> is your job. It is the word to use with clients.</w:t>
+      </w:r>
+    </w:p>
+    <w:p>
+      <w:pPr>
+        <w:pStyle w:val="ListBullet"/>
+        <w:spacing w:after="60"/>
+      </w:pPr>
+      <w:r>
+        <w:rPr>
+          <w:b/>
+          <w:sz w:val="21"/>
+        </w:rPr>
+        <w:t>Platform Admin</w:t>
+      </w:r>
+      <w:r>
+        <w:rPr>
+          <w:b w:val="0"/>
+          <w:sz w:val="21"/>
+        </w:rPr>
+        <w:t xml:space="preserve"> is your login role inside the admin panel. That is what the system calls your access level, not your job.</w:t>
+      </w:r>
+    </w:p>
+    <w:p>
+      <w:pPr>
+        <w:pStyle w:val="ListBullet"/>
+        <w:spacing w:after="60"/>
+      </w:pPr>
+      <w:r>
+        <w:rPr>
+          <w:b/>
+          <w:sz w:val="21"/>
+        </w:rPr>
+        <w:t>Contact Specialist</w:t>
+      </w:r>
+      <w:r>
+        <w:rPr>
+          <w:b w:val="0"/>
+          <w:sz w:val="21"/>
+        </w:rPr>
+        <w:t xml:space="preserve"> is the label currently shown on a store's detail page for the person holding that relationship, which is you. It means the same thing as Account Manager; the panel is inconsistent about the wording and will be tidied up.</w:t>
+      </w:r>
+    </w:p>
+    <w:p>
+      <w:pPr>
+        <w:spacing w:after="120"/>
+      </w:pPr>
+      <w:r>
+        <w:rPr>
+          <w:b/>
+          <w:sz w:val="21"/>
+        </w:rPr>
+        <w:t xml:space="preserve">One word to avoid: </w:t>
+      </w:r>
+      <w:r>
+        <w:rPr>
+          <w:b w:val="0"/>
+          <w:sz w:val="21"/>
+        </w:rPr>
+        <w:t>"CRM". It is the category of software used to track customer relationships, not a job title. You are the account manager; a CRM is a tool.</w:t>
       </w:r>
     </w:p>
     <w:p>
@@ -187,7 +259,7 @@
           <w:b w:val="0"/>
           <w:sz w:val="21"/>
         </w:rPr>
-        <w:t>More branches, higher plan, more staff trained — each one is billable.</w:t>
+        <w:t>More branches, higher plan, more staff trained. Each one is billable.</w:t>
       </w:r>
     </w:p>
     <w:p>
@@ -208,7 +280,7 @@
           <w:i w:val="0"/>
           <w:sz w:val="21"/>
         </w:rPr>
-        <w:t>Each partner has their own named login. Never share an account — every action in the panel is logged against the person who performed it, so a shared login makes it impossible to tell who did what.</w:t>
+        <w:t>Each partner has their own named login. Never share an account, because every action in the panel is logged against the person who performed it, so a shared login makes it impossible to tell who did what.</w:t>
       </w:r>
     </w:p>
     <w:p>
@@ -454,7 +526,7 @@
               <w:rPr>
                 <w:sz w:val="20"/>
               </w:rPr>
-              <w:t>Your account already exists. Your password is sent to you separately, through a private channel. Change it the first time you log in, and never send it over WhatsApp, email or anywhere it can be forwarded. If you think it has been seen by anyone else, say so immediately — it is reset in under a minute and nobody will be annoyed.</w:t>
+              <w:t>Your account already exists. Your password is sent to you separately, through a private channel. Change it the first time you log in, and never send it over WhatsApp, email or anywhere it can be forwarded. If you think it has been seen by anyone else, say so immediately. It is reset in under a minute and nobody will be annoyed.</w:t>
             </w:r>
           </w:p>
         </w:tc>
@@ -771,7 +843,7 @@
               <w:rPr>
                 <w:sz w:val="19"/>
               </w:rPr>
-              <w:t>No — ask the owner</w:t>
+              <w:t>No, ask the owner</w:t>
             </w:r>
           </w:p>
         </w:tc>
@@ -945,7 +1017,7 @@
               <w:rPr>
                 <w:sz w:val="20"/>
               </w:rPr>
-              <w:t>you cannot issue it yourself — the panel will refuse. Send the request to the owner and it will be applied to the account. Agree the offer with the client only after it is approved, never before.</w:t>
+              <w:t>you cannot issue it yourself, because the panel will refuse. Send the request to the owner and it will be applied to the account. Agree the offer with the client only after it is approved, never before.</w:t>
             </w:r>
           </w:p>
         </w:tc>
@@ -1150,7 +1222,7 @@
               <w:rPr>
                 <w:sz w:val="19"/>
               </w:rPr>
-              <w:t>The business account — 100%</w:t>
+              <w:t>The business account, 100%</w:t>
             </w:r>
           </w:p>
         </w:tc>
@@ -1181,7 +1253,7 @@
               <w:rPr>
                 <w:sz w:val="19"/>
               </w:rPr>
-              <w:t>You — 100%</w:t>
+              <w:t>You, 100%</w:t>
             </w:r>
           </w:p>
         </w:tc>
@@ -1212,7 +1284,7 @@
               <w:rPr>
                 <w:sz w:val="19"/>
               </w:rPr>
-              <w:t>You — 100%</w:t>
+              <w:t>You, 100%</w:t>
             </w:r>
           </w:p>
         </w:tc>
@@ -1243,7 +1315,7 @@
               <w:rPr>
                 <w:sz w:val="19"/>
               </w:rPr>
-              <w:t>You — 100%</w:t>
+              <w:t>You, 100%</w:t>
             </w:r>
           </w:p>
         </w:tc>
@@ -1274,7 +1346,7 @@
               <w:rPr>
                 <w:sz w:val="19"/>
               </w:rPr>
-              <w:t>You — 100%</w:t>
+              <w:t>You, 100%</w:t>
             </w:r>
           </w:p>
         </w:tc>
@@ -1305,7 +1377,7 @@
               <w:rPr>
                 <w:sz w:val="19"/>
               </w:rPr>
-              <w:t>You — 100%</w:t>
+              <w:t>You, 100%</w:t>
             </w:r>
           </w:p>
         </w:tc>
@@ -1336,7 +1408,7 @@
               <w:rPr>
                 <w:sz w:val="19"/>
               </w:rPr>
-              <w:t>You — 100%</w:t>
+              <w:t>You, 100%</w:t>
             </w:r>
           </w:p>
         </w:tc>
@@ -1561,7 +1633,7 @@
               <w:rPr>
                 <w:sz w:val="20"/>
               </w:rPr>
-              <w:t>Not in cash, not to your own account, not "I will forward it". The payment has to land in the business account for the plan to be activated correctly, and routing it through yourself breaks the records the client's own subscription depends on. Your service fee is billed separately and paid to you directly — keep the two conversations and the two payments completely apart.</w:t>
+              <w:t>Not in cash, not to your own account, not "I will forward it". The payment has to land in the business account for the plan to be activated correctly, and routing it through yourself breaks the records the client's own subscription depends on. Your service fee is billed separately and paid to you directly. keep the two conversations and the two payments completely apart.</w:t>
             </w:r>
           </w:p>
         </w:tc>
@@ -1590,7 +1662,7 @@
           <w:i w:val="0"/>
           <w:sz w:val="21"/>
         </w:rPr>
-        <w:t>Current plans. Quote these accurately — the client will see them in the app.</w:t>
+        <w:t>Current plans. Quote these accurately, because the client will see them in the app.</w:t>
       </w:r>
     </w:p>
     <w:tbl>
@@ -1949,7 +2021,7 @@
           <w:i w:val="0"/>
           <w:sz w:val="21"/>
         </w:rPr>
-        <w:t>Your service fee is yours to set. It should reflect the work in front of you — a single-branch pharmacy with 80 products is not the same job as a three-branch operation with 4,000 lines and no usable records.</w:t>
+        <w:t>Your service fee is yours to set. It should reflect the work in front of you. A single-branch pharmacy with 80 products is not the same job as a three-branch operation with 4,000 lines and no usable records.</w:t>
       </w:r>
     </w:p>
     <w:p>
@@ -2019,7 +2091,7 @@
                 <w:b/>
                 <w:sz w:val="19"/>
               </w:rPr>
-              <w:t>Light — install, basic setup, short training, small catalogue</w:t>
+              <w:t>Light: install, basic setup, short training, small catalogue</w:t>
             </w:r>
           </w:p>
         </w:tc>
@@ -2033,7 +2105,7 @@
               <w:rPr>
                 <w:sz w:val="19"/>
               </w:rPr>
-              <w:t>₦30,000 – ₦50,000</w:t>
+              <w:t>₦30,000 to ₦50,000</w:t>
             </w:r>
           </w:p>
         </w:tc>
@@ -2050,7 +2122,7 @@
                 <w:b/>
                 <w:sz w:val="19"/>
               </w:rPr>
-              <w:t>Standard — full setup, data migration, staff training</w:t>
+              <w:t>Standard: full setup, data migration, staff training</w:t>
             </w:r>
           </w:p>
         </w:tc>
@@ -2064,7 +2136,7 @@
               <w:rPr>
                 <w:sz w:val="19"/>
               </w:rPr>
-              <w:t>₦50,000 – ₦80,000</w:t>
+              <w:t>₦50,000 to ₦80,000</w:t>
             </w:r>
           </w:p>
         </w:tc>
@@ -2081,7 +2153,7 @@
                 <w:b/>
                 <w:sz w:val="19"/>
               </w:rPr>
-              <w:t>Heavy — multi-branch, large catalogue, expiry and batch data entry</w:t>
+              <w:t>Heavy: multi-branch, large catalogue, expiry and batch data entry</w:t>
             </w:r>
           </w:p>
         </w:tc>
@@ -2095,7 +2167,7 @@
               <w:rPr>
                 <w:sz w:val="19"/>
               </w:rPr>
-              <w:t>₦80,000 – ₦100,000+</w:t>
+              <w:t>₦80,000 to ₦100,000+</w:t>
             </w:r>
           </w:p>
         </w:tc>
@@ -2116,7 +2188,7 @@
           <w:i w:val="0"/>
           <w:sz w:val="21"/>
         </w:rPr>
-        <w:t>For context on what the market bears: operators in this space have been known to charge ₦200,000 and above, and one quotes ₦350,000 for everything including the top subscription plan. Against our Enterprise year at ₦150,000, that implies roughly ₦200,000 of service. Price with confidence — but price the work, not the client's desperation.</w:t>
+        <w:t>For context on what the market bears: operators in this space have been known to charge ₦200,000 and above, and one quotes ₦350,000 for everything including the top subscription plan. Against our Enterprise year at ₦150,000, that implies roughly ₦200,000 of service. Price with confidence, but price the work, not the client's desperation.</w:t>
       </w:r>
     </w:p>
     <w:p>
@@ -2285,7 +2357,7 @@
           <w:i w:val="0"/>
           <w:sz w:val="21"/>
         </w:rPr>
-        <w:t>Use free time deliberately. It is most effective when the client is nearly convinced and needs one more month of their own data to be sure — and least effective when used to avoid a pricing conversation.</w:t>
+        <w:t>Use free time deliberately. It is most effective when the client is nearly convinced and needs one more month of their own data to be sure. It is least effective when used to avoid a pricing conversation.</w:t>
       </w:r>
     </w:p>
     <w:p>
@@ -2571,7 +2643,7 @@
               <w:rPr>
                 <w:sz w:val="19"/>
               </w:rPr>
-              <w:t>Business account — Moniepoint 6656081317, 100%</w:t>
+              <w:t>Business account, Moniepoint 6656081317, 100%</w:t>
             </w:r>
           </w:p>
         </w:tc>
@@ -2695,7 +2767,7 @@
               <w:rPr>
                 <w:sz w:val="19"/>
               </w:rPr>
-              <w:t>₦30,000 – ₦100,000, based on the work</w:t>
+              <w:t>₦30,000 to ₦100,000, based on the work</w:t>
             </w:r>
           </w:p>
         </w:tc>
@@ -2726,7 +2798,7 @@
               <w:rPr>
                 <w:sz w:val="19"/>
               </w:rPr>
-              <w:t>No — discount your own fee instead</w:t>
+              <w:t>No, discount your own fee instead</w:t>
             </w:r>
           </w:p>
         </w:tc>

</xml_diff>

<commit_message>
docs: commit the partner SOP changes made outside this session, contents unreviewed
</commit_message>
<xml_diff>
--- a/docs/partner-sop/DumosRx-Partner-SOP.docx
+++ b/docs/partner-sop/DumosRx-Partner-SOP.docx
@@ -1033,7 +1033,466 @@
         <w:pStyle w:val="Heading1"/>
       </w:pPr>
       <w:r>
-        <w:t>3. How a store becomes yours</w:t>
+        <w:t>3. Your practice store</w:t>
+      </w:r>
+    </w:p>
+    <w:p>
+      <w:pPr>
+        <w:spacing w:after="120"/>
+      </w:pPr>
+      <w:r>
+        <w:rPr>
+          <w:b w:val="0"/>
+          <w:i w:val="0"/>
+          <w:sz w:val="21"/>
+        </w:rPr>
+        <w:t>You each have your own store account on the Dev server, so you can learn the app, rehearse a demo and train someone without touching a real pharmacy. It uses the same email address as your admin login, which is possible precisely because Dev is a separate database; the password is sent to you separately.</w:t>
+      </w:r>
+    </w:p>
+    <w:p>
+      <w:pPr>
+        <w:spacing w:after="120"/>
+      </w:pPr>
+      <w:r>
+        <w:rPr>
+          <w:b/>
+          <w:sz w:val="21"/>
+        </w:rPr>
+        <w:t xml:space="preserve">Dev is a completely separate database from production. </w:t>
+      </w:r>
+      <w:r>
+        <w:rPr>
+          <w:b w:val="0"/>
+          <w:sz w:val="21"/>
+        </w:rPr>
+        <w:t>Nothing you do in your practice store can reach a real client's data, and nothing in it counts towards platform figures. Break it freely, that is what it is for.</w:t>
+      </w:r>
+    </w:p>
+    <w:p>
+      <w:pPr>
+        <w:spacing w:after="60"/>
+      </w:pPr>
+      <w:r>
+        <w:rPr>
+          <w:b w:val="0"/>
+          <w:i w:val="0"/>
+          <w:sz w:val="21"/>
+        </w:rPr>
+        <w:t>Your two accounts live on two different servers, and this is deliberate:</w:t>
+      </w:r>
+    </w:p>
+    <w:tbl>
+      <w:tblPr>
+        <w:tblStyle w:val="TableGrid"/>
+        <w:tblW w:type="auto" w:w="0"/>
+        <w:jc w:val="center"/>
+        <w:tblLook w:firstColumn="1" w:firstRow="1" w:lastColumn="0" w:lastRow="0" w:noHBand="0" w:noVBand="1" w:val="04A0"/>
+      </w:tblPr>
+      <w:tblGrid>
+        <w:gridCol w:w="3216"/>
+        <w:gridCol w:w="3216"/>
+        <w:gridCol w:w="3216"/>
+      </w:tblGrid>
+      <w:tr>
+        <w:tc>
+          <w:tcPr>
+            <w:tcW w:type="dxa" w:w="3456"/>
+            <w:shd w:fill="0B5D4A"/>
+          </w:tcPr>
+          <w:p>
+            <w:r/>
+            <w:r>
+              <w:rPr>
+                <w:b/>
+                <w:color w:val="FFFFFF"/>
+                <w:sz w:val="19"/>
+              </w:rPr>
+              <w:t>Account</w:t>
+            </w:r>
+          </w:p>
+        </w:tc>
+        <w:tc>
+          <w:tcPr>
+            <w:tcW w:type="dxa" w:w="1872"/>
+            <w:shd w:fill="0B5D4A"/>
+          </w:tcPr>
+          <w:p>
+            <w:r/>
+            <w:r>
+              <w:rPr>
+                <w:b/>
+                <w:color w:val="FFFFFF"/>
+                <w:sz w:val="19"/>
+              </w:rPr>
+              <w:t>Server</w:t>
+            </w:r>
+          </w:p>
+        </w:tc>
+        <w:tc>
+          <w:tcPr>
+            <w:tcW w:type="dxa" w:w="4176"/>
+            <w:shd w:fill="0B5D4A"/>
+          </w:tcPr>
+          <w:p>
+            <w:r/>
+            <w:r>
+              <w:rPr>
+                <w:b/>
+                <w:color w:val="FFFFFF"/>
+                <w:sz w:val="19"/>
+              </w:rPr>
+              <w:t>Used for</w:t>
+            </w:r>
+          </w:p>
+        </w:tc>
+      </w:tr>
+      <w:tr>
+        <w:tc>
+          <w:tcPr>
+            <w:tcW w:type="dxa" w:w="3456"/>
+          </w:tcPr>
+          <w:p>
+            <w:r/>
+            <w:r>
+              <w:rPr>
+                <w:b/>
+                <w:sz w:val="19"/>
+              </w:rPr>
+              <w:t>Platform Admin (admin panel)</w:t>
+            </w:r>
+          </w:p>
+        </w:tc>
+        <w:tc>
+          <w:tcPr>
+            <w:tcW w:type="dxa" w:w="1872"/>
+          </w:tcPr>
+          <w:p>
+            <w:r/>
+            <w:r>
+              <w:rPr>
+                <w:sz w:val="19"/>
+              </w:rPr>
+              <w:t>Production</w:t>
+            </w:r>
+          </w:p>
+        </w:tc>
+        <w:tc>
+          <w:tcPr>
+            <w:tcW w:type="dxa" w:w="4176"/>
+          </w:tcPr>
+          <w:p>
+            <w:r/>
+            <w:r>
+              <w:rPr>
+                <w:sz w:val="19"/>
+              </w:rPr>
+              <w:t>Real partner work: registering stores, managing your clients</w:t>
+            </w:r>
+          </w:p>
+        </w:tc>
+      </w:tr>
+      <w:tr>
+        <w:tc>
+          <w:tcPr>
+            <w:tcW w:type="dxa" w:w="3456"/>
+          </w:tcPr>
+          <w:p>
+            <w:r/>
+            <w:r>
+              <w:rPr>
+                <w:b/>
+                <w:sz w:val="19"/>
+              </w:rPr>
+              <w:t>Store owner (practice store)</w:t>
+            </w:r>
+          </w:p>
+        </w:tc>
+        <w:tc>
+          <w:tcPr>
+            <w:tcW w:type="dxa" w:w="1872"/>
+          </w:tcPr>
+          <w:p>
+            <w:r/>
+            <w:r>
+              <w:rPr>
+                <w:sz w:val="19"/>
+              </w:rPr>
+              <w:t>Dev</w:t>
+            </w:r>
+          </w:p>
+        </w:tc>
+        <w:tc>
+          <w:tcPr>
+            <w:tcW w:type="dxa" w:w="4176"/>
+          </w:tcPr>
+          <w:p>
+            <w:r/>
+            <w:r>
+              <w:rPr>
+                <w:sz w:val="19"/>
+              </w:rPr>
+              <w:t>Learning, demos, training, testing a migration</w:t>
+            </w:r>
+          </w:p>
+        </w:tc>
+      </w:tr>
+    </w:tbl>
+    <w:p>
+      <w:pPr>
+        <w:spacing w:after="80"/>
+      </w:pPr>
+    </w:p>
+    <w:p>
+      <w:pPr>
+        <w:pStyle w:val="Heading2"/>
+      </w:pPr>
+      <w:r>
+        <w:t>Switching to Dev, and what not to switch</w:t>
+      </w:r>
+    </w:p>
+    <w:p>
+      <w:pPr>
+        <w:spacing w:after="120"/>
+      </w:pPr>
+      <w:r>
+        <w:rPr>
+          <w:b/>
+          <w:sz w:val="21"/>
+        </w:rPr>
+        <w:t xml:space="preserve">Only the POS app switches. </w:t>
+      </w:r>
+      <w:r>
+        <w:rPr>
+          <w:b w:val="0"/>
+          <w:sz w:val="21"/>
+        </w:rPr>
+        <w:t>To use your practice store, open Settings, then Data, then Server Config, and choose the Staging / Dev server. Switch it back to Production when you are finished.</w:t>
+      </w:r>
+    </w:p>
+    <w:tbl>
+      <w:tblPr>
+        <w:tblStyle w:val="TableGrid"/>
+        <w:tblW w:type="auto" w:w="0"/>
+        <w:tblLook w:firstColumn="1" w:firstRow="1" w:lastColumn="0" w:lastRow="0" w:noHBand="0" w:noVBand="1" w:val="04A0"/>
+      </w:tblPr>
+      <w:tblGrid>
+        <w:gridCol w:w="9648"/>
+      </w:tblGrid>
+      <w:tr>
+        <w:tc>
+          <w:tcPr>
+            <w:tcW w:type="dxa" w:w="9648"/>
+            <w:shd w:fill="FDECEA"/>
+          </w:tcPr>
+          <w:p>
+            <w:r/>
+            <w:r>
+              <w:rPr>
+                <w:b/>
+                <w:sz w:val="20"/>
+              </w:rPr>
+              <w:t xml:space="preserve">Leave the admin panel on Production. Always.  </w:t>
+            </w:r>
+            <w:r>
+              <w:rPr>
+                <w:sz w:val="20"/>
+              </w:rPr>
+              <w:t>Your Platform Admin account exists only on Production, so pointing the panel at Dev will simply refuse your login and look like a broken account. There is no reason to switch it: the panel is for real client work, and your practice store is reached through the POS app instead.</w:t>
+            </w:r>
+          </w:p>
+        </w:tc>
+      </w:tr>
+    </w:tbl>
+    <w:p>
+      <w:pPr>
+        <w:spacing w:after="80"/>
+      </w:pPr>
+    </w:p>
+    <w:tbl>
+      <w:tblPr>
+        <w:tblStyle w:val="TableGrid"/>
+        <w:tblW w:type="auto" w:w="0"/>
+        <w:tblLook w:firstColumn="1" w:firstRow="1" w:lastColumn="0" w:lastRow="0" w:noHBand="0" w:noVBand="1" w:val="04A0"/>
+      </w:tblPr>
+      <w:tblGrid>
+        <w:gridCol w:w="9648"/>
+      </w:tblGrid>
+      <w:tr>
+        <w:tc>
+          <w:tcPr>
+            <w:tcW w:type="dxa" w:w="9648"/>
+            <w:shd w:fill="FDECEA"/>
+          </w:tcPr>
+          <w:p>
+            <w:r/>
+            <w:r>
+              <w:rPr>
+                <w:b/>
+                <w:sz w:val="20"/>
+              </w:rPr>
+              <w:t xml:space="preserve">Switch the POS app back to Production before you do anything real.  </w:t>
+            </w:r>
+            <w:r>
+              <w:rPr>
+                <w:sz w:val="20"/>
+              </w:rPr>
+              <w:t>This is the one way to cause actual damage with a practice account. Left on Dev, a real pharmacy's setup goes into a throwaway database and is lost. Worse, demoing while pointed at Production puts invented stock and fake sales into a live account. Check which server the app is on before every real session.</w:t>
+            </w:r>
+          </w:p>
+        </w:tc>
+      </w:tr>
+    </w:tbl>
+    <w:p>
+      <w:pPr>
+        <w:spacing w:after="80"/>
+      </w:pPr>
+    </w:p>
+    <w:p>
+      <w:pPr>
+        <w:pStyle w:val="Heading2"/>
+      </w:pPr>
+      <w:r>
+        <w:t>What it is good for</w:t>
+      </w:r>
+    </w:p>
+    <w:p>
+      <w:pPr>
+        <w:pStyle w:val="ListBullet"/>
+        <w:spacing w:after="60"/>
+      </w:pPr>
+      <w:r>
+        <w:rPr>
+          <w:b/>
+          <w:sz w:val="21"/>
+        </w:rPr>
+        <w:t xml:space="preserve">Learning the flow </w:t>
+      </w:r>
+      <w:r>
+        <w:rPr>
+          <w:b w:val="0"/>
+          <w:sz w:val="21"/>
+        </w:rPr>
+        <w:t>end to end: receive stock, sell, close the day, read the reports.</w:t>
+      </w:r>
+    </w:p>
+    <w:p>
+      <w:pPr>
+        <w:pStyle w:val="ListBullet"/>
+        <w:spacing w:after="60"/>
+      </w:pPr>
+      <w:r>
+        <w:rPr>
+          <w:b/>
+          <w:sz w:val="21"/>
+        </w:rPr>
+        <w:t xml:space="preserve">Rehearsing a demo </w:t>
+      </w:r>
+      <w:r>
+        <w:rPr>
+          <w:b w:val="0"/>
+          <w:sz w:val="21"/>
+        </w:rPr>
+        <w:t>so you are not discovering a screen in front of a client.</w:t>
+      </w:r>
+    </w:p>
+    <w:p>
+      <w:pPr>
+        <w:pStyle w:val="ListBullet"/>
+        <w:spacing w:after="60"/>
+      </w:pPr>
+      <w:r>
+        <w:rPr>
+          <w:b/>
+          <w:sz w:val="21"/>
+        </w:rPr>
+        <w:t xml:space="preserve">Testing a migration </w:t>
+      </w:r>
+      <w:r>
+        <w:rPr>
+          <w:b w:val="0"/>
+          <w:sz w:val="21"/>
+        </w:rPr>
+        <w:t>before you run it for real: load the client's product list into your practice store first and see what the data actually looks like.</w:t>
+      </w:r>
+    </w:p>
+    <w:p>
+      <w:pPr>
+        <w:pStyle w:val="ListBullet"/>
+        <w:spacing w:after="60"/>
+      </w:pPr>
+      <w:r>
+        <w:rPr>
+          <w:b/>
+          <w:sz w:val="21"/>
+        </w:rPr>
+        <w:t xml:space="preserve">Training staff </w:t>
+      </w:r>
+      <w:r>
+        <w:rPr>
+          <w:b w:val="0"/>
+          <w:sz w:val="21"/>
+        </w:rPr>
+        <w:t>without risking a pharmacy's live figures.</w:t>
+      </w:r>
+    </w:p>
+    <w:p>
+      <w:pPr>
+        <w:spacing w:after="80"/>
+      </w:pPr>
+      <w:r>
+        <w:rPr>
+          <w:b w:val="0"/>
+          <w:i w:val="0"/>
+          <w:sz w:val="21"/>
+        </w:rPr>
+        <w:t>Never put a real client's data in your practice store beyond what you need to test a format. It is a throwaway environment and it is not backed up for you.</w:t>
+      </w:r>
+    </w:p>
+    <w:tbl>
+      <w:tblPr>
+        <w:tblStyle w:val="TableGrid"/>
+        <w:tblW w:type="auto" w:w="0"/>
+        <w:tblLook w:firstColumn="1" w:firstRow="1" w:lastColumn="0" w:lastRow="0" w:noHBand="0" w:noVBand="1" w:val="04A0"/>
+      </w:tblPr>
+      <w:tblGrid>
+        <w:gridCol w:w="9648"/>
+      </w:tblGrid>
+      <w:tr>
+        <w:tc>
+          <w:tcPr>
+            <w:tcW w:type="dxa" w:w="9648"/>
+            <w:shd w:fill="FFF8E1"/>
+          </w:tcPr>
+          <w:p>
+            <w:r/>
+            <w:r>
+              <w:rPr>
+                <w:b/>
+                <w:sz w:val="20"/>
+              </w:rPr>
+              <w:t xml:space="preserve">Practice stores are flagged as demo accounts.  </w:t>
+            </w:r>
+            <w:r>
+              <w:rPr>
+                <w:sz w:val="20"/>
+              </w:rPr>
+              <w:t>That flag keeps them out of the platform's trend and revenue figures. If you ever need a demo store on Production rather than Dev, ask first and it will be created with that flag set, so your practice numbers never get mistaken for real business.</w:t>
+            </w:r>
+          </w:p>
+        </w:tc>
+      </w:tr>
+    </w:tbl>
+    <w:p>
+      <w:pPr>
+        <w:spacing w:after="80"/>
+      </w:pPr>
+    </w:p>
+    <w:p>
+      <w:pPr>
+        <w:pStyle w:val="Heading1"/>
+      </w:pPr>
+      <w:r>
+        <w:t>4. How a store becomes yours</w:t>
       </w:r>
     </w:p>
     <w:p>
@@ -1133,7 +1592,7 @@
         <w:pStyle w:val="Heading1"/>
       </w:pPr>
       <w:r>
-        <w:t>4. The money: what is the business's, what is yours</w:t>
+        <w:t>5. The money: what is the business's, what is yours</w:t>
       </w:r>
     </w:p>
     <w:p>
@@ -1649,7 +2108,7 @@
         <w:pStyle w:val="Heading1"/>
       </w:pPr>
       <w:r>
-        <w:t>5. Subscription plans (what the client pays the business)</w:t>
+        <w:t>6. Subscription plans (what the client pays the business)</w:t>
       </w:r>
     </w:p>
     <w:p>
@@ -2008,7 +2467,7 @@
         <w:pStyle w:val="Heading1"/>
       </w:pPr>
       <w:r>
-        <w:t>6. What you charge, and how much</w:t>
+        <w:t>7. What you charge, and how much</w:t>
       </w:r>
     </w:p>
     <w:p>
@@ -2284,7 +2743,7 @@
         <w:pStyle w:val="Heading1"/>
       </w:pPr>
       <w:r>
-        <w:t>7. Trials and free periods</w:t>
+        <w:t>8. Trials and free periods</w:t>
       </w:r>
     </w:p>
     <w:p>
@@ -2365,7 +2824,7 @@
         <w:pStyle w:val="Heading1"/>
       </w:pPr>
       <w:r>
-        <w:t>8. Looking after your stores</w:t>
+        <w:t>9. Looking after your stores</w:t>
       </w:r>
     </w:p>
     <w:p>
@@ -2466,7 +2925,7 @@
         <w:pStyle w:val="Heading1"/>
       </w:pPr>
       <w:r>
-        <w:t>9. Conduct</w:t>
+        <w:t>10. Conduct</w:t>
       </w:r>
     </w:p>
     <w:p>
@@ -2567,7 +3026,7 @@
         <w:pStyle w:val="Heading1"/>
       </w:pPr>
       <w:r>
-        <w:t>10. Quick reference</w:t>
+        <w:t>11. Quick reference</w:t>
       </w:r>
     </w:p>
     <w:tbl>
@@ -2861,6 +3320,99 @@
                 <w:sz w:val="19"/>
               </w:rPr>
               <w:t>The owner, immediately, with details</w:t>
+            </w:r>
+          </w:p>
+        </w:tc>
+      </w:tr>
+      <w:tr>
+        <w:tc>
+          <w:tcPr>
+            <w:tcW w:type="dxa" w:w="4464"/>
+          </w:tcPr>
+          <w:p>
+            <w:r/>
+            <w:r>
+              <w:rPr>
+                <w:b/>
+                <w:sz w:val="19"/>
+              </w:rPr>
+              <w:t>Where do I practice?</w:t>
+            </w:r>
+          </w:p>
+        </w:tc>
+        <w:tc>
+          <w:tcPr>
+            <w:tcW w:type="dxa" w:w="5040"/>
+          </w:tcPr>
+          <w:p>
+            <w:r/>
+            <w:r>
+              <w:rPr>
+                <w:sz w:val="19"/>
+              </w:rPr>
+              <w:t>Your own store on the Dev server, same email</w:t>
+            </w:r>
+          </w:p>
+        </w:tc>
+      </w:tr>
+      <w:tr>
+        <w:tc>
+          <w:tcPr>
+            <w:tcW w:type="dxa" w:w="4464"/>
+          </w:tcPr>
+          <w:p>
+            <w:r/>
+            <w:r>
+              <w:rPr>
+                <w:b/>
+                <w:sz w:val="19"/>
+              </w:rPr>
+              <w:t>Which server is my admin login on?</w:t>
+            </w:r>
+          </w:p>
+        </w:tc>
+        <w:tc>
+          <w:tcPr>
+            <w:tcW w:type="dxa" w:w="5040"/>
+          </w:tcPr>
+          <w:p>
+            <w:r/>
+            <w:r>
+              <w:rPr>
+                <w:sz w:val="19"/>
+              </w:rPr>
+              <w:t>Production only. Never switch the panel to Dev</w:t>
+            </w:r>
+          </w:p>
+        </w:tc>
+      </w:tr>
+      <w:tr>
+        <w:tc>
+          <w:tcPr>
+            <w:tcW w:type="dxa" w:w="4464"/>
+          </w:tcPr>
+          <w:p>
+            <w:r/>
+            <w:r>
+              <w:rPr>
+                <w:b/>
+                <w:sz w:val="19"/>
+              </w:rPr>
+              <w:t>What must I check before real work?</w:t>
+            </w:r>
+          </w:p>
+        </w:tc>
+        <w:tc>
+          <w:tcPr>
+            <w:tcW w:type="dxa" w:w="5040"/>
+          </w:tcPr>
+          <w:p>
+            <w:r/>
+            <w:r>
+              <w:rPr>
+                <w:sz w:val="19"/>
+              </w:rPr>
+              <w:t>That the app is pointed at Production, not Dev</w:t>
             </w:r>
           </w:p>
         </w:tc>

</xml_diff>